<commit_message>
1.2.2.14 Export & Import step 3a: revenue written without its unit (D16)
Pure revenueUnitsCheck + targetingMinimum (value-normalize.js): revenue per employee against the larger of the
real headcount and the low end of the smallest size band ticked in Setup; below 10,000 per employee (default
currency) the value is impossible, the unit (thousand/million/billion) that lands it at 20k-2m is suggested.
New Decisions kind "Revenue without its unit" from a stored value (Correct it / Keep), a web finding for an empty
field or an import (Correct it / Don't use it); Remove account when the real headcount is below the targeting
minimum (HT5 AG). Web fills, bulk research, both automatic resolves and imports hold such a value and its currency
back. On the 9 Oct export exactly the 7 accounts + HT5 AG of 570 are flagged. 32 harness checks.
Design: Salesforce column lists from Salesforce's sample files, four choices agreed (section 8).

Co-Authored-By: Claude Opus 5.5 <noreply@anthropic.com>
</commit_message>
<xml_diff>
--- a/EXPORT_IMPORT_DESIGN.docx
+++ b/EXPORT_IMPORT_DESIGN.docx
@@ -4278,6 +4278,285 @@
     </w:p>
     <w:p>
       <w:pPr>
+        <w:pStyle w:val="ListBullet"/>
+      </w:pPr>
+      <w:r>
+        <w:rPr>
+          <w:b/>
+        </w:rPr>
+        <w:t>Salesforce's own sample files (Boaz, 2026-10-09)</w:t>
+      </w:r>
+      <w:r>
+        <w:rPr>
+          <w:b w:val="0"/>
+        </w:rPr>
+        <w:t xml:space="preserve"> fix the column titles. The export writes exactly these,</w:t>
+      </w:r>
+    </w:p>
+    <w:p>
+      <w:r>
+        <w:rPr>
+          <w:b w:val="0"/>
+        </w:rPr>
+        <w:t xml:space="preserve">  in this order, so the Data Import Wizard maps every column by itself; columns SalesTeam has no value for stay</w:t>
+      </w:r>
+    </w:p>
+    <w:p>
+      <w:r>
+        <w:rPr>
+          <w:b w:val="0"/>
+        </w:rPr>
+        <w:t xml:space="preserve">  empty. *Agreed 2026-10-09 (Boaz: all four - Type, revenue currency, Lead Source, Consent Status):*</w:t>
+      </w:r>
+    </w:p>
+    <w:p>
+      <w:r>
+        <w:rPr>
+          <w:b w:val="0"/>
+        </w:rPr>
+        <w:t xml:space="preserve">  - </w:t>
+      </w:r>
+      <w:r>
+        <w:rPr>
+          <w:b/>
+        </w:rPr>
+        <w:t>Accounts:</w:t>
+      </w:r>
+      <w:r>
+        <w:rPr>
+          <w:b w:val="0"/>
+        </w:rPr>
+        <w:t xml:space="preserve"> Account Name, Annual Revenue, Billing Street, Billing City, Billing State/Province, Billing</w:t>
+      </w:r>
+    </w:p>
+    <w:p>
+      <w:r>
+        <w:rPr>
+          <w:b w:val="0"/>
+        </w:rPr>
+        <w:t xml:space="preserve">    Zip/Postal Code, Billing Country, Description, Employees, Fax, Industry, Phone, Shipping Street, Shipping City,</w:t>
+      </w:r>
+    </w:p>
+    <w:p>
+      <w:r>
+        <w:rPr>
+          <w:b w:val="0"/>
+        </w:rPr>
+        <w:t xml:space="preserve">    Shipping State/Province, Shipping Zip/Postal Code, Shipping Country, Type, Website.</w:t>
+      </w:r>
+    </w:p>
+    <w:p>
+      <w:r>
+        <w:rPr>
+          <w:b w:val="0"/>
+        </w:rPr>
+        <w:t xml:space="preserve">    - </w:t>
+      </w:r>
+      <w:r>
+        <w:rPr>
+          <w:b/>
+        </w:rPr>
+        <w:t>Type is the relationship, not Public/Private</w:t>
+      </w:r>
+      <w:r>
+        <w:rPr>
+          <w:b w:val="0"/>
+        </w:rPr>
+        <w:t xml:space="preserve"> (the samples hold Customer / Reseller - Salesforce's</w:t>
+      </w:r>
+    </w:p>
+    <w:p>
+      <w:r>
+        <w:rPr>
+          <w:b w:val="0"/>
+        </w:rPr>
+        <w:t xml:space="preserve">      Account Type list): customer -&gt; Customer, partner -&gt; Partner, everyone else -&gt; Prospect. Public/private goes</w:t>
+      </w:r>
+    </w:p>
+    <w:p>
+      <w:r>
+        <w:rPr>
+          <w:b w:val="0"/>
+        </w:rPr>
+        <w:t xml:space="preserve">      into Description with the priority, LinkedIn page and SalesTeam id.</w:t>
+      </w:r>
+    </w:p>
+    <w:p>
+      <w:r>
+        <w:rPr>
+          <w:b w:val="0"/>
+        </w:rPr>
+        <w:t xml:space="preserve">    - Billing address from the registry address where there is one, else the HQ city and country. Shipping, Phone</w:t>
+      </w:r>
+    </w:p>
+    <w:p>
+      <w:r>
+        <w:rPr>
+          <w:b w:val="0"/>
+        </w:rPr>
+        <w:t xml:space="preserve">      and Fax stay empty.</w:t>
+      </w:r>
+    </w:p>
+    <w:p>
+      <w:r>
+        <w:rPr>
+          <w:b w:val="0"/>
+        </w:rPr>
+        <w:t xml:space="preserve">    - </w:t>
+      </w:r>
+      <w:r>
+        <w:rPr>
+          <w:b/>
+        </w:rPr>
+        <w:t>Annual Revenue is a plain number with no currency in its title</w:t>
+      </w:r>
+      <w:r>
+        <w:rPr>
+          <w:b w:val="0"/>
+        </w:rPr>
+        <w:t xml:space="preserve"> (the wizard would not map</w:t>
+      </w:r>
+    </w:p>
+    <w:p>
+      <w:r>
+        <w:rPr>
+          <w:b w:val="0"/>
+        </w:rPr>
+        <w:t xml:space="preserve">      "Annual Revenue (USD)" by itself), so the export pop-up names the currency (D14), and an import of such a</w:t>
+      </w:r>
+    </w:p>
+    <w:p>
+      <w:r>
+        <w:rPr>
+          <w:b w:val="0"/>
+        </w:rPr>
+        <w:t xml:space="preserve">      file asks for it (D15 case 3).</w:t>
+      </w:r>
+    </w:p>
+    <w:p>
+      <w:r>
+        <w:rPr>
+          <w:b w:val="0"/>
+        </w:rPr>
+        <w:t xml:space="preserve">  - </w:t>
+      </w:r>
+      <w:r>
+        <w:rPr>
+          <w:b/>
+        </w:rPr>
+        <w:t>Contacts:</w:t>
+      </w:r>
+      <w:r>
+        <w:rPr>
+          <w:b w:val="0"/>
+        </w:rPr>
+        <w:t xml:space="preserve"> First Name, Last Name, Email, Phone, Title, Account Name, Mailing Street, Mailing City, Mailing</w:t>
+      </w:r>
+    </w:p>
+    <w:p>
+      <w:r>
+        <w:rPr>
+          <w:b w:val="0"/>
+        </w:rPr>
+        <w:t xml:space="preserve">    State/Province, Mailing Zip/Postal Code, Mailing Country, Lead Source, Consent Status, plus </w:t>
+      </w:r>
+      <w:r>
+        <w:rPr>
+          <w:b/>
+        </w:rPr>
+        <w:t>Description</w:t>
+      </w:r>
+    </w:p>
+    <w:p>
+      <w:r>
+        <w:rPr>
+          <w:b w:val="0"/>
+        </w:rPr>
+        <w:t xml:space="preserve">    (the LinkedIn profile; the wizard maps it by name).</w:t>
+      </w:r>
+    </w:p>
+    <w:p>
+      <w:r>
+        <w:rPr>
+          <w:b w:val="0"/>
+        </w:rPr>
+        <w:t xml:space="preserve">    - Account Name exactly as in the accounts file, so the wizard links each contact to its account.</w:t>
+      </w:r>
+    </w:p>
+    <w:p>
+      <w:r>
+        <w:rPr>
+          <w:b w:val="0"/>
+        </w:rPr>
+        <w:t xml:space="preserve">    - </w:t>
+      </w:r>
+      <w:r>
+        <w:rPr>
+          <w:b/>
+        </w:rPr>
+        <w:t>Lead Source "Other"</w:t>
+      </w:r>
+      <w:r>
+        <w:rPr>
+          <w:b w:val="0"/>
+        </w:rPr>
+        <w:t>, not "Social": the standard list has no LinkedIn value, and "Other" exists in every</w:t>
+      </w:r>
+    </w:p>
+    <w:p>
+      <w:r>
+        <w:rPr>
+          <w:b w:val="0"/>
+        </w:rPr>
+        <w:t xml:space="preserve">      org.</w:t>
+      </w:r>
+    </w:p>
+    <w:p>
+      <w:r>
+        <w:rPr>
+          <w:b w:val="0"/>
+        </w:rPr>
+        <w:t xml:space="preserve">    - </w:t>
+      </w:r>
+      <w:r>
+        <w:rPr>
+          <w:b/>
+        </w:rPr>
+        <w:t>Consent Status always empty</w:t>
+      </w:r>
+      <w:r>
+        <w:rPr>
+          <w:b w:val="0"/>
+        </w:rPr>
+        <w:t>: SalesTeam never knows whether a person agreed to marketing, and must not</w:t>
+      </w:r>
+    </w:p>
+    <w:p>
+      <w:r>
+        <w:rPr>
+          <w:b w:val="0"/>
+        </w:rPr>
+        <w:t xml:space="preserve">      claim it.</w:t>
+      </w:r>
+    </w:p>
+    <w:p>
+      <w:r>
+        <w:rPr>
+          <w:b w:val="0"/>
+        </w:rPr>
+        <w:t xml:space="preserve">  - Import reads the same titles (and the API names above), so a file exported from Salesforce in this shape comes</w:t>
+      </w:r>
+    </w:p>
+    <w:p>
+      <w:r>
+        <w:rPr>
+          <w:b w:val="0"/>
+        </w:rPr>
+        <w:t xml:space="preserve">    back in as it went out.</w:t>
+      </w:r>
+    </w:p>
+    <w:p>
+      <w:pPr>
         <w:pStyle w:val="Heading2"/>
       </w:pPr>
       <w:r>
@@ -5315,6 +5594,176 @@
           <w:b w:val="0"/>
         </w:rPr>
         <w:t xml:space="preserve"> as well.</w:t>
+      </w:r>
+    </w:p>
+    <w:p>
+      <w:r>
+        <w:rPr>
+          <w:b w:val="0"/>
+        </w:rPr>
+        <w:t xml:space="preserve">  - </w:t>
+      </w:r>
+      <w:r>
+        <w:rPr>
+          <w:b/>
+        </w:rPr>
+        <w:t>Built in 1.2.2.14.</w:t>
+      </w:r>
+      <w:r>
+        <w:rPr>
+          <w:b w:val="0"/>
+        </w:rPr>
+        <w:t xml:space="preserve"> Pure </w:t>
+      </w:r>
+      <w:r>
+        <w:rPr>
+          <w:rFonts w:ascii="Consolas" w:hAnsi="Consolas"/>
+          <w:b w:val="0"/>
+        </w:rPr>
+        <w:t>revenueUnitsCheck</w:t>
+      </w:r>
+      <w:r>
+        <w:rPr>
+          <w:b w:val="0"/>
+        </w:rPr>
+        <w:t xml:space="preserve"> and </w:t>
+      </w:r>
+      <w:r>
+        <w:rPr>
+          <w:rFonts w:ascii="Consolas" w:hAnsi="Consolas"/>
+          <w:b w:val="0"/>
+        </w:rPr>
+        <w:t>targetingMinimum</w:t>
+      </w:r>
+      <w:r>
+        <w:rPr>
+          <w:b w:val="0"/>
+        </w:rPr>
+        <w:t xml:space="preserve"> in value-normalize.js (local revenue is</w:t>
+      </w:r>
+    </w:p>
+    <w:p>
+      <w:r>
+        <w:rPr>
+          <w:b w:val="0"/>
+        </w:rPr>
+        <w:t xml:space="preserve">    judged only against a real local headcount). Decisions kind "Revenue without its unit", one card per value, from</w:t>
+      </w:r>
+    </w:p>
+    <w:p>
+      <w:r>
+        <w:rPr>
+          <w:b w:val="0"/>
+        </w:rPr>
+        <w:t xml:space="preserve">    three places: a stored value (</w:t>
+      </w:r>
+      <w:r>
+        <w:rPr>
+          <w:b/>
+        </w:rPr>
+        <w:t>Correct it</w:t>
+      </w:r>
+      <w:r>
+        <w:rPr>
+          <w:b w:val="0"/>
+        </w:rPr>
+        <w:t xml:space="preserve"> / </w:t>
+      </w:r>
+      <w:r>
+        <w:rPr>
+          <w:b/>
+        </w:rPr>
+        <w:t>Keep</w:t>
+      </w:r>
+      <w:r>
+        <w:rPr>
+          <w:b w:val="0"/>
+        </w:rPr>
+        <w:t xml:space="preserve"> - Keep remembers the value), a web finding for an empty</w:t>
+      </w:r>
+    </w:p>
+    <w:p>
+      <w:r>
+        <w:rPr>
+          <w:b w:val="0"/>
+        </w:rPr>
+        <w:t xml:space="preserve">    field and an import (</w:t>
+      </w:r>
+      <w:r>
+        <w:rPr>
+          <w:b/>
+        </w:rPr>
+        <w:t>Correct it</w:t>
+      </w:r>
+      <w:r>
+        <w:rPr>
+          <w:b w:val="0"/>
+        </w:rPr>
+        <w:t xml:space="preserve"> / </w:t>
+      </w:r>
+      <w:r>
+        <w:rPr>
+          <w:b/>
+        </w:rPr>
+        <w:t>Don't use it</w:t>
+      </w:r>
+      <w:r>
+        <w:rPr>
+          <w:b w:val="0"/>
+        </w:rPr>
+        <w:t xml:space="preserve">); </w:t>
+      </w:r>
+      <w:r>
+        <w:rPr>
+          <w:b/>
+        </w:rPr>
+        <w:t>Remove account</w:t>
+      </w:r>
+      <w:r>
+        <w:rPr>
+          <w:b w:val="0"/>
+        </w:rPr>
+        <w:t xml:space="preserve"> only when the real headcount is below</w:t>
+      </w:r>
+    </w:p>
+    <w:p>
+      <w:r>
+        <w:rPr>
+          <w:b w:val="0"/>
+        </w:rPr>
+        <w:t xml:space="preserve">    the targeting minimum, and no unit is suggested when the value is credible for that headcount (HT5 AG).</w:t>
+      </w:r>
+    </w:p>
+    <w:p>
+      <w:r>
+        <w:rPr>
+          <w:b w:val="0"/>
+        </w:rPr>
+        <w:t xml:space="preserve">    "Also for the others" groups cards with the same origin and unit. Web fills (pipeline, bulk research, automatic</w:t>
+      </w:r>
+    </w:p>
+    <w:p>
+      <w:r>
+        <w:rPr>
+          <w:b w:val="0"/>
+        </w:rPr>
+        <w:t xml:space="preserve">    resolve) and imports hold such a value and its currency back. A hand edit is not blocked: a value typed without</w:t>
+      </w:r>
+    </w:p>
+    <w:p>
+      <w:r>
+        <w:rPr>
+          <w:b w:val="0"/>
+        </w:rPr>
+        <w:t xml:space="preserve">    its unit shows up as a card right after Save. Checked against the 9 Oct export: exactly the 7 accounts + HT5 AG</w:t>
+      </w:r>
+    </w:p>
+    <w:p>
+      <w:r>
+        <w:rPr>
+          <w:b w:val="0"/>
+        </w:rPr>
+        <w:t xml:space="preserve">    of 570 are flagged.</w:t>
       </w:r>
     </w:p>
     <w:p>

</xml_diff>

<commit_message>
1.2.2.15 Export & Import step 3b: one currency (D13-D15)
Revenue shown, sorted, filtered and exported in the default currency; the stored
amount and its currency stay as found (tooltip / account page "from X CHF").
SalesTeam CSV titles "Global Revenue (USD)" / "Local Revenue (USD)" without the
"... Currency" columns; HubSpot export names the currency in its pop-up.
Import never guesses: per-row currency > currency in the title > a pop-up with
no pre-selected answer (CSV, HubSpot and research workbook), with a live
plausibility warning (pure currencyPlausibility, revenueTitleCurrency).
Harness 869 checks.

Co-Authored-By: Claude Opus 5.5 <noreply@anthropic.com>
</commit_message>
<xml_diff>
--- a/EXPORT_IMPORT_DESIGN.docx
+++ b/EXPORT_IMPORT_DESIGN.docx
@@ -5345,6 +5345,82 @@
           <w:b w:val="0"/>
         </w:rPr>
         <w:t xml:space="preserve"> in csv-import.js), with harness cases.</w:t>
+      </w:r>
+    </w:p>
+    <w:p>
+      <w:r>
+        <w:rPr>
+          <w:b w:val="0"/>
+        </w:rPr>
+        <w:t xml:space="preserve">  - </w:t>
+      </w:r>
+      <w:r>
+        <w:rPr>
+          <w:b/>
+        </w:rPr>
+        <w:t>Built in 1.2.2.15.</w:t>
+      </w:r>
+      <w:r>
+        <w:rPr>
+          <w:b w:val="0"/>
+        </w:rPr>
+        <w:t xml:space="preserve"> Table cells, sorting, text filters and the account page show the default currency, the</w:t>
+      </w:r>
+    </w:p>
+    <w:p>
+      <w:r>
+        <w:rPr>
+          <w:b w:val="0"/>
+        </w:rPr>
+        <w:t xml:space="preserve">    original in the tooltip (account page: "(from … CHF)"); a local revenue without its own currency is in the global</w:t>
+      </w:r>
+    </w:p>
+    <w:p>
+      <w:r>
+        <w:rPr>
+          <w:b w:val="0"/>
+        </w:rPr>
+        <w:t xml:space="preserve">    one. SalesTeam CSV titles "Global Revenue (USD)" / "Local Revenue (USD)" without the "… Currency" columns; the</w:t>
+      </w:r>
+    </w:p>
+    <w:p>
+      <w:r>
+        <w:rPr>
+          <w:b w:val="0"/>
+        </w:rPr>
+        <w:t xml:space="preserve">    HubSpot file keeps the title "Annual Revenue" (HubSpot maps it by that exact name) and the export pop-up says</w:t>
+      </w:r>
+    </w:p>
+    <w:p>
+      <w:r>
+        <w:rPr>
+          <w:b w:val="0"/>
+        </w:rPr>
+        <w:t xml:space="preserve">    "Annual Revenue is in USD". The currency question is its own small pop-up right after the file is read (before</w:t>
+      </w:r>
+    </w:p>
+    <w:p>
+      <w:r>
+        <w:rPr>
+          <w:b w:val="0"/>
+        </w:rPr>
+        <w:t xml:space="preserve">    the check-first summary), so the plausibility warning shows as soon as a currency is picked; it is asked for the</w:t>
+      </w:r>
+    </w:p>
+    <w:p>
+      <w:r>
+        <w:rPr>
+          <w:b w:val="0"/>
+        </w:rPr>
+        <w:t xml:space="preserve">    research workbook too, and not for a value that names its currency ("CHF 102m"). The Import window's dropdown</w:t>
+      </w:r>
+    </w:p>
+    <w:p>
+      <w:r>
+        <w:rPr>
+          <w:b w:val="0"/>
+        </w:rPr>
+        <w:t xml:space="preserve">    is gone.</w:t>
       </w:r>
     </w:p>
     <w:p>

</xml_diff>

<commit_message>
1.2.2.16 Export & Import step 3c: Salesforce export and import
New pure crm-files.js (one column table per CRM; Dynamics adds its own once the
header rows are in). Export… writes Salesforce's sample-file columns exactly
(Type = Customer/Partner/Prospect, Lead Source Other, Consent Status empty);
Description carries "Label: value" lines read back on import for an exact round
trip. Billing address from the registry address in the registry's country.
Import… reads labels and API names; an org's Billing City/Country = HQ.
26 harness checks (895). Live-tested OK.

Co-Authored-By: Claude Opus 5.5 <noreply@anthropic.com>
</commit_message>
<xml_diff>
--- a/EXPORT_IMPORT_DESIGN.docx
+++ b/EXPORT_IMPORT_DESIGN.docx
@@ -4553,6 +4553,224 @@
           <w:b w:val="0"/>
         </w:rPr>
         <w:t xml:space="preserve">    back in as it went out.</w:t>
+      </w:r>
+    </w:p>
+    <w:p>
+      <w:pPr>
+        <w:pStyle w:val="ListBullet"/>
+      </w:pPr>
+      <w:r>
+        <w:rPr>
+          <w:b/>
+        </w:rPr>
+        <w:t>Built in 1.2.2.16</w:t>
+      </w:r>
+      <w:r>
+        <w:rPr>
+          <w:b w:val="0"/>
+        </w:rPr>
+        <w:t xml:space="preserve"> (pure </w:t>
+      </w:r>
+      <w:r>
+        <w:rPr>
+          <w:rFonts w:ascii="Consolas" w:hAnsi="Consolas"/>
+          <w:b w:val="0"/>
+        </w:rPr>
+        <w:t>crm-files.js</w:t>
+      </w:r>
+      <w:r>
+        <w:rPr>
+          <w:b w:val="0"/>
+        </w:rPr>
+        <w:t>, one column table per CRM - Dynamics adds its own table once the header</w:t>
+      </w:r>
+    </w:p>
+    <w:p>
+      <w:r>
+        <w:rPr>
+          <w:b w:val="0"/>
+        </w:rPr>
+        <w:t xml:space="preserve">  rows are in). Export… and Import… offer Salesforce; files </w:t>
+      </w:r>
+      <w:r>
+        <w:rPr>
+          <w:rFonts w:ascii="Consolas" w:hAnsi="Consolas"/>
+          <w:b w:val="0"/>
+        </w:rPr>
+        <w:t>SalesTeam-Salesforce-accounts/contacts-&lt;stamp&gt;.csv</w:t>
+      </w:r>
+      <w:r>
+        <w:rPr>
+          <w:b w:val="0"/>
+        </w:rPr>
+        <w:t>.</w:t>
+      </w:r>
+    </w:p>
+    <w:p>
+      <w:r>
+        <w:rPr>
+          <w:b w:val="0"/>
+        </w:rPr>
+        <w:t xml:space="preserve">  - </w:t>
+      </w:r>
+      <w:r>
+        <w:rPr>
+          <w:b/>
+        </w:rPr>
+        <w:t>Description holds "Label: value" lines</w:t>
+      </w:r>
+      <w:r>
+        <w:rPr>
+          <w:b w:val="0"/>
+        </w:rPr>
+        <w:t xml:space="preserve"> - priority (with score), company type, LinkedIn page, HQ city, HQ</w:t>
+      </w:r>
+    </w:p>
+    <w:p>
+      <w:r>
+        <w:rPr>
+          <w:b w:val="0"/>
+        </w:rPr>
+        <w:t xml:space="preserve">    country, registry address, </w:t>
+      </w:r>
+      <w:r>
+        <w:rPr>
+          <w:rFonts w:ascii="Consolas" w:hAnsi="Consolas"/>
+          <w:b w:val="0"/>
+        </w:rPr>
+        <w:t>SalesTeam id</w:t>
+      </w:r>
+      <w:r>
+        <w:rPr>
+          <w:b w:val="0"/>
+        </w:rPr>
+        <w:t xml:space="preserve"> (contacts: LinkedIn profile, id) - and Import reads them back. A file</w:t>
+      </w:r>
+    </w:p>
+    <w:p>
+      <w:r>
+        <w:rPr>
+          <w:b w:val="0"/>
+        </w:rPr>
+        <w:t xml:space="preserve">    whose Description carries </w:t>
+      </w:r>
+      <w:r>
+        <w:rPr>
+          <w:rFonts w:ascii="Consolas" w:hAnsi="Consolas"/>
+          <w:b w:val="0"/>
+        </w:rPr>
+        <w:t>SalesTeam id</w:t>
+      </w:r>
+      <w:r>
+        <w:rPr>
+          <w:b w:val="0"/>
+        </w:rPr>
+        <w:t xml:space="preserve"> is SalesTeam's own: its Billing columns were worked out from those lines</w:t>
+      </w:r>
+    </w:p>
+    <w:p>
+      <w:r>
+        <w:rPr>
+          <w:b w:val="0"/>
+        </w:rPr>
+        <w:t xml:space="preserve">    and are not read again, so the HQ round-trips exactly. A Salesforce org's own file: Billing City / Country are read</w:t>
+      </w:r>
+    </w:p>
+    <w:p>
+      <w:r>
+        <w:rPr>
+          <w:b w:val="0"/>
+        </w:rPr>
+        <w:t xml:space="preserve">    as the HQ city / country.</w:t>
+      </w:r>
+    </w:p>
+    <w:p>
+      <w:r>
+        <w:rPr>
+          <w:b w:val="0"/>
+        </w:rPr>
+        <w:t xml:space="preserve">  - </w:t>
+      </w:r>
+      <w:r>
+        <w:rPr>
+          <w:b/>
+        </w:rPr>
+        <w:t>Billing address:</w:t>
+      </w:r>
+      <w:r>
+        <w:rPr>
+          <w:b w:val="0"/>
+        </w:rPr>
+        <w:t xml:space="preserve"> a registry address of the form "street, ZIP city[, state][, country]" is split into the</w:t>
+      </w:r>
+    </w:p>
+    <w:p>
+      <w:r>
+        <w:rPr>
+          <w:b w:val="0"/>
+        </w:rPr>
+        <w:t xml:space="preserve">    Billing columns; its country is the one the address names, else Setup's single target country, else the HQ</w:t>
+      </w:r>
+    </w:p>
+    <w:p>
+      <w:r>
+        <w:rPr>
+          <w:b w:val="0"/>
+        </w:rPr>
+        <w:t xml:space="preserve">    country when the HQ is in the same city, else empty (about 100 accounts hold a Swiss registry address under a</w:t>
+      </w:r>
+    </w:p>
+    <w:p>
+      <w:r>
+        <w:rPr>
+          <w:b w:val="0"/>
+        </w:rPr>
+        <w:t xml:space="preserve">    foreign HQ - a French Billing Country under a Winterthur street would be wrong). An address in no such shape</w:t>
+      </w:r>
+    </w:p>
+    <w:p>
+      <w:r>
+        <w:rPr>
+          <w:b w:val="0"/>
+        </w:rPr>
+        <w:t xml:space="preserve">    leaves Billing Street empty and uses the HQ city and country.</w:t>
+      </w:r>
+    </w:p>
+    <w:p>
+      <w:r>
+        <w:rPr>
+          <w:b w:val="0"/>
+        </w:rPr>
+        <w:t xml:space="preserve">  - Record ids ("Account ID" / "Contact ID" / "Id") become </w:t>
+      </w:r>
+      <w:r>
+        <w:rPr>
+          <w:rFonts w:ascii="Consolas" w:hAnsi="Consolas"/>
+          <w:b w:val="0"/>
+        </w:rPr>
+        <w:t>SF-&lt;id&gt;</w:t>
+      </w:r>
+      <w:r>
+        <w:rPr>
+          <w:b w:val="0"/>
+        </w:rPr>
+        <w:t>; a revenue that names its currency ("USD 1,500,000")</w:t>
+      </w:r>
+    </w:p>
+    <w:p>
+      <w:r>
+        <w:rPr>
+          <w:b w:val="0"/>
+        </w:rPr>
+        <w:t xml:space="preserve">    keeps it, a plain number is asked for (D15 case 3). Industry is written as free text - still to be checked</w:t>
+      </w:r>
+    </w:p>
+    <w:p>
+      <w:r>
+        <w:rPr>
+          <w:b w:val="0"/>
+        </w:rPr>
+        <w:t xml:space="preserve">    against a real org's picklist.</w:t>
       </w:r>
     </w:p>
     <w:p>

</xml_diff>

<commit_message>
1.2.2.17 Salesforce fixes from the first real import + headcount as a whole number
Salesforce refused 9 of 569 accounts. Fixed in the file: Employees and Annual
Revenue as whole numbers, no Billing State (a canton is refused for
Switzerland), one city cut at ";"/"(" and to 40 characters, every column cut to
Salesforce's length limit. Re-import: all 7 added. The other 2 were the org's
duplicate rule.

Boaz: a headcount is always a whole number. Full-time equivalents from annual
reports (SNB 941.2) are now rounded before storing - web findings, imports,
hand edits (wholeEmployees, value-normalize.js) - and repairEmployeeDecimals
rounds stored values once on the update. Harness 905 / 190.

Co-Authored-By: Claude Opus 5.5 <noreply@anthropic.com>
</commit_message>
<xml_diff>
--- a/EXPORT_IMPORT_DESIGN.docx
+++ b/EXPORT_IMPORT_DESIGN.docx
@@ -4771,6 +4771,138 @@
           <w:b w:val="0"/>
         </w:rPr>
         <w:t xml:space="preserve">    against a real org's picklist.</w:t>
+      </w:r>
+    </w:p>
+    <w:p>
+      <w:pPr>
+        <w:pStyle w:val="ListBullet"/>
+      </w:pPr>
+      <w:r>
+        <w:rPr>
+          <w:b/>
+        </w:rPr>
+        <w:t>First real import (Salesforce Starter trial, 2026-10-10):</w:t>
+      </w:r>
+      <w:r>
+        <w:rPr>
+          <w:b w:val="0"/>
+        </w:rPr>
+        <w:t xml:space="preserve"> 559 of 569 added, 1 skipped, 9 refused. Industry as</w:t>
+      </w:r>
+    </w:p>
+    <w:p>
+      <w:r>
+        <w:rPr>
+          <w:b w:val="0"/>
+        </w:rPr>
+        <w:t xml:space="preserve">  free text was accepted. Fixed in 1.2.2.17: Employees and Annual Revenue are written as whole numbers (six refusals</w:t>
+      </w:r>
+    </w:p>
+    <w:p>
+      <w:r>
+        <w:rPr>
+          <w:b w:val="0"/>
+        </w:rPr>
+        <w:t xml:space="preserve">  for values such as 72.8); Billing State is never written (a canton "VD" is refused for Switzerland when the org's</w:t>
+      </w:r>
+    </w:p>
+    <w:p>
+      <w:r>
+        <w:rPr>
+          <w:b w:val="0"/>
+        </w:rPr>
+        <w:t xml:space="preserve">  state and country lists are on); a city is one city, cut at ";" or "(" and at most 40 characters (PepsiCo's 63-character</w:t>
+      </w:r>
+    </w:p>
+    <w:p>
+      <w:r>
+        <w:rPr>
+          <w:b w:val="0"/>
+        </w:rPr>
+        <w:t xml:space="preserve">  HQ text) - the full text stays in Description; every column is cut to Salesforce's length limit. The other two</w:t>
+      </w:r>
+    </w:p>
+    <w:p>
+      <w:r>
+        <w:rPr>
+          <w:b w:val="0"/>
+        </w:rPr>
+        <w:t xml:space="preserve">  (Luzerner Kantonsspital, Novartis Pharma Schweiz) were Salesforce's own duplicate rule matching another account -</w:t>
+      </w:r>
+    </w:p>
+    <w:p>
+      <w:r>
+        <w:rPr>
+          <w:b w:val="0"/>
+        </w:rPr>
+        <w:t xml:space="preserve">  an org setting, not a file error.</w:t>
+      </w:r>
+    </w:p>
+    <w:p>
+      <w:pPr>
+        <w:pStyle w:val="ListBullet"/>
+      </w:pPr>
+      <w:r>
+        <w:rPr>
+          <w:b/>
+        </w:rPr>
+        <w:t>Headcount stored as a whole number (Boaz, 2026-10-10).</w:t>
+      </w:r>
+      <w:r>
+        <w:rPr>
+          <w:b w:val="0"/>
+        </w:rPr>
+        <w:t xml:space="preserve"> The six refused Employees values were full-time</w:t>
+      </w:r>
+    </w:p>
+    <w:p>
+      <w:r>
+        <w:rPr>
+          <w:b w:val="0"/>
+        </w:rPr>
+        <w:t xml:space="preserve">  equivalents from annual reports (Swiss National Bank 941.2). Since 1.2.2.17 every way in rounds them before they are</w:t>
+      </w:r>
+    </w:p>
+    <w:p>
+      <w:r>
+        <w:rPr>
+          <w:b w:val="0"/>
+        </w:rPr>
+        <w:t xml:space="preserve">  stored - web findings, imports, hand edits (</w:t>
+      </w:r>
+      <w:r>
+        <w:rPr>
+          <w:rFonts w:ascii="Consolas" w:hAnsi="Consolas"/>
+          <w:b w:val="0"/>
+        </w:rPr>
+        <w:t>wholeEmployees</w:t>
+      </w:r>
+      <w:r>
+        <w:rPr>
+          <w:b w:val="0"/>
+        </w:rPr>
+        <w:t xml:space="preserve">, value-normalize.js) - and </w:t>
+      </w:r>
+      <w:r>
+        <w:rPr>
+          <w:rFonts w:ascii="Consolas" w:hAnsi="Consolas"/>
+          <w:b w:val="0"/>
+        </w:rPr>
+        <w:t>repairEmployeeDecimals</w:t>
+      </w:r>
+      <w:r>
+        <w:rPr>
+          <w:b w:val="0"/>
+        </w:rPr>
+        <w:t xml:space="preserve"> rounds</w:t>
+      </w:r>
+    </w:p>
+    <w:p>
+      <w:r>
+        <w:rPr>
+          <w:b w:val="0"/>
+        </w:rPr>
+        <w:t xml:space="preserve">  what was stored before, once, on the update (workbook rows, overrides, open import differences; one Activity Log line).</w:t>
       </w:r>
     </w:p>
     <w:p>

</xml_diff>